<commit_message>
state estimation and navigation engineer
</commit_message>
<xml_diff>
--- a/Marika_Nishi_Resume.docx
+++ b/Marika_Nishi_Resume.docx
@@ -44,15 +44,7 @@
           <w:sz w:val="21"/>
           <w:szCs w:val="12"/>
         </w:rPr>
-        <w:t>Controls</w:t>
-      </w:r>
-      <w:r>
-        <w:rPr>
-          <w:rFonts w:ascii="Times New Roman" w:hAnsi="Times New Roman" w:cs="Times New Roman"/>
-          <w:sz w:val="21"/>
-          <w:szCs w:val="12"/>
-        </w:rPr>
-        <w:t xml:space="preserve"> Engineer</w:t>
+        <w:t>Robotics Simulation Engineer – Physical AI &amp; Digital Twins</w:t>
       </w:r>
     </w:p>
     <w:p>
@@ -828,113 +820,25 @@
           <w:sz w:val="21"/>
           <w:szCs w:val="21"/>
         </w:rPr>
-        <w:t xml:space="preserve">Linux, </w:t>
-      </w:r>
-      <w:r>
-        <w:rPr>
-          <w:rFonts w:ascii="Garamond" w:hAnsi="Garamond" w:cs="Arial"/>
-          <w:iCs/>
-          <w:sz w:val="21"/>
-          <w:szCs w:val="21"/>
-        </w:rPr>
-        <w:t xml:space="preserve">navigation, state estimation, </w:t>
-      </w:r>
-      <w:r>
-        <w:rPr>
-          <w:rFonts w:ascii="Garamond" w:hAnsi="Garamond" w:cs="Arial"/>
-          <w:iCs/>
-          <w:sz w:val="21"/>
-          <w:szCs w:val="21"/>
-        </w:rPr>
-        <w:t>autonomous vehicle</w:t>
-      </w:r>
-      <w:r>
-        <w:rPr>
-          <w:rFonts w:ascii="Garamond" w:hAnsi="Garamond" w:cs="Arial"/>
-          <w:iCs/>
-          <w:sz w:val="21"/>
-          <w:szCs w:val="21"/>
-        </w:rPr>
-        <w:t xml:space="preserve">, </w:t>
-      </w:r>
-      <w:r>
-        <w:rPr>
-          <w:rFonts w:ascii="Garamond" w:hAnsi="Garamond" w:cs="Arial"/>
-          <w:iCs/>
-          <w:sz w:val="21"/>
-          <w:szCs w:val="21"/>
-        </w:rPr>
-        <w:t xml:space="preserve">UAV, </w:t>
-      </w:r>
-      <w:r>
-        <w:rPr>
-          <w:rFonts w:ascii="Garamond" w:hAnsi="Garamond" w:cs="Arial"/>
-          <w:iCs/>
-          <w:sz w:val="21"/>
-          <w:szCs w:val="21"/>
-        </w:rPr>
-        <w:t xml:space="preserve">computer vision, </w:t>
-      </w:r>
-      <w:r>
-        <w:rPr>
-          <w:rFonts w:ascii="Garamond" w:hAnsi="Garamond" w:cs="Arial"/>
-          <w:iCs/>
-          <w:sz w:val="21"/>
-          <w:szCs w:val="21"/>
-        </w:rPr>
-        <w:t xml:space="preserve">sensor fusion, </w:t>
-      </w:r>
-      <w:r>
-        <w:rPr>
-          <w:rFonts w:ascii="Garamond" w:hAnsi="Garamond" w:cs="Arial"/>
-          <w:sz w:val="21"/>
-          <w:szCs w:val="21"/>
-        </w:rPr>
-        <w:t xml:space="preserve">OpenCV, </w:t>
-      </w:r>
-      <w:r>
-        <w:rPr>
-          <w:rFonts w:ascii="Garamond" w:hAnsi="Garamond" w:cs="Arial"/>
-          <w:iCs/>
-          <w:sz w:val="21"/>
-          <w:szCs w:val="21"/>
-        </w:rPr>
-        <w:t>AI</w:t>
-      </w:r>
-      <w:r>
-        <w:rPr>
-          <w:rFonts w:ascii="Garamond" w:hAnsi="Garamond" w:cs="Arial"/>
-          <w:iCs/>
-          <w:sz w:val="21"/>
-          <w:szCs w:val="21"/>
-        </w:rPr>
-        <w:t xml:space="preserve">, </w:t>
-      </w:r>
-      <w:r>
-        <w:rPr>
-          <w:rFonts w:ascii="Garamond" w:hAnsi="Garamond" w:cs="Arial"/>
-          <w:iCs/>
-          <w:sz w:val="21"/>
-          <w:szCs w:val="21"/>
-        </w:rPr>
-        <w:t xml:space="preserve">ML, </w:t>
-      </w:r>
-      <w:r>
-        <w:rPr>
-          <w:rFonts w:ascii="Garamond" w:hAnsi="Garamond" w:cs="Arial"/>
-          <w:sz w:val="21"/>
-          <w:szCs w:val="21"/>
-        </w:rPr>
-        <w:t xml:space="preserve">path-planning, control, ML-based control, simulator (Gazebo, IsaacSim), </w:t>
-      </w:r>
-      <w:r>
-        <w:rPr>
-          <w:rFonts w:ascii="Garamond" w:hAnsi="Garamond" w:cs="Arial"/>
-          <w:iCs/>
-          <w:sz w:val="21"/>
-          <w:szCs w:val="21"/>
-        </w:rPr>
-        <w:t>Git</w:t>
+        <w:t xml:space="preserve">KF variants, guidance, control, GPS-contested navigation, sensor fusion, </w:t>
+      </w:r>
+      <w:r>
+        <w:rPr>
+          <w:rFonts w:ascii="Garamond" w:hAnsi="Garamond" w:cs="Arial"/>
+          <w:iCs/>
+          <w:sz w:val="21"/>
+          <w:szCs w:val="21"/>
+        </w:rPr>
+        <w:t xml:space="preserve">vision, EKF/UKF, mobile robotics, field robotics, Jetson, Linux, </w:t>
+      </w:r>
+      <w:r>
+        <w:rPr>
+          <w:rFonts w:ascii="Garamond" w:hAnsi="Garamond" w:cs="Arial"/>
+          <w:iCs/>
+          <w:sz w:val="21"/>
+          <w:szCs w:val="21"/>
+        </w:rPr>
+        <w:t>simulation, estimators, validation, tracking</w:t>
       </w:r>
     </w:p>
     <w:p>
@@ -973,15 +877,47 @@
           <w:sz w:val="21"/>
           <w:szCs w:val="21"/>
         </w:rPr>
-        <w:t xml:space="preserve">mechatronics, </w:t>
-      </w:r>
-      <w:r>
-        <w:rPr>
-          <w:rFonts w:ascii="Garamond" w:hAnsi="Garamond" w:cs="Arial"/>
-          <w:sz w:val="21"/>
-          <w:szCs w:val="21"/>
-        </w:rPr>
-        <w:t xml:space="preserve">CAD, </w:t>
+        <w:t xml:space="preserve">GNSS, </w:t>
+      </w:r>
+      <w:r>
+        <w:rPr>
+          <w:rFonts w:ascii="Garamond" w:hAnsi="Garamond" w:cs="Arial"/>
+          <w:sz w:val="21"/>
+          <w:szCs w:val="21"/>
+        </w:rPr>
+        <w:t>LiDAR</w:t>
+      </w:r>
+      <w:r>
+        <w:rPr>
+          <w:rFonts w:ascii="Garamond" w:hAnsi="Garamond" w:cs="Arial"/>
+          <w:sz w:val="21"/>
+          <w:szCs w:val="21"/>
+        </w:rPr>
+        <w:t>,</w:t>
+      </w:r>
+      <w:r>
+        <w:rPr>
+          <w:rFonts w:ascii="Garamond" w:hAnsi="Garamond" w:cs="Arial"/>
+          <w:sz w:val="21"/>
+          <w:szCs w:val="21"/>
+        </w:rPr>
+        <w:t xml:space="preserve"> </w:t>
+      </w:r>
+      <w:r>
+        <w:rPr>
+          <w:rFonts w:ascii="Garamond" w:hAnsi="Garamond" w:cs="Arial"/>
+          <w:sz w:val="21"/>
+          <w:szCs w:val="21"/>
+        </w:rPr>
+        <w:t>camera</w:t>
+      </w:r>
+      <w:r>
+        <w:rPr>
+          <w:rFonts w:ascii="Garamond" w:hAnsi="Garamond" w:cs="Arial"/>
+          <w:sz w:val="21"/>
+          <w:szCs w:val="21"/>
+        </w:rPr>
+        <w:t xml:space="preserve">s, IMU, </w:t>
       </w:r>
       <w:r>
         <w:rPr>
@@ -997,38 +933,6 @@
           <w:sz w:val="21"/>
           <w:szCs w:val="21"/>
         </w:rPr>
-        <w:t xml:space="preserve">SolidWorks, </w:t>
-      </w:r>
-      <w:r>
-        <w:rPr>
-          <w:rFonts w:ascii="Garamond" w:hAnsi="Garamond" w:cs="Arial"/>
-          <w:sz w:val="21"/>
-          <w:szCs w:val="21"/>
-        </w:rPr>
-        <w:t>GNSS</w:t>
-      </w:r>
-      <w:r>
-        <w:rPr>
-          <w:rFonts w:ascii="Garamond" w:hAnsi="Garamond" w:cs="Arial"/>
-          <w:sz w:val="21"/>
-          <w:szCs w:val="21"/>
-        </w:rPr>
-        <w:t xml:space="preserve">, </w:t>
-      </w:r>
-      <w:r>
-        <w:rPr>
-          <w:rFonts w:ascii="Garamond" w:hAnsi="Garamond" w:cs="Arial"/>
-          <w:sz w:val="21"/>
-          <w:szCs w:val="21"/>
-        </w:rPr>
-        <w:t xml:space="preserve">IMU, </w:t>
-      </w:r>
-      <w:r>
-        <w:rPr>
-          <w:rFonts w:ascii="Garamond" w:hAnsi="Garamond" w:cs="Arial"/>
-          <w:sz w:val="21"/>
-          <w:szCs w:val="21"/>
-        </w:rPr>
         <w:t xml:space="preserve">sensor-data collection, </w:t>
       </w:r>
       <w:r>
@@ -1037,39 +941,15 @@
           <w:sz w:val="21"/>
           <w:szCs w:val="21"/>
         </w:rPr>
-        <w:t>LiDAR</w:t>
-      </w:r>
-      <w:r>
-        <w:rPr>
-          <w:rFonts w:ascii="Garamond" w:hAnsi="Garamond" w:cs="Arial"/>
-          <w:sz w:val="21"/>
-          <w:szCs w:val="21"/>
-        </w:rPr>
-        <w:t>,</w:t>
-      </w:r>
-      <w:r>
-        <w:rPr>
-          <w:rFonts w:ascii="Garamond" w:hAnsi="Garamond" w:cs="Arial"/>
-          <w:sz w:val="21"/>
-          <w:szCs w:val="21"/>
-        </w:rPr>
-        <w:t xml:space="preserve"> </w:t>
-      </w:r>
-      <w:r>
-        <w:rPr>
-          <w:rFonts w:ascii="Garamond" w:hAnsi="Garamond" w:cs="Arial"/>
-          <w:sz w:val="21"/>
-          <w:szCs w:val="21"/>
-        </w:rPr>
-        <w:t>camera</w:t>
-      </w:r>
-      <w:r>
-        <w:rPr>
-          <w:rFonts w:ascii="Garamond" w:hAnsi="Garamond" w:cs="Arial"/>
-          <w:sz w:val="21"/>
-          <w:szCs w:val="21"/>
-        </w:rPr>
-        <w:t>s</w:t>
+        <w:t>mechatronics, CAD</w:t>
+      </w:r>
+      <w:r>
+        <w:rPr>
+          <w:rFonts w:ascii="Garamond" w:hAnsi="Garamond" w:cs="Arial"/>
+          <w:sz w:val="21"/>
+          <w:szCs w:val="21"/>
+        </w:rPr>
+        <w:t>, SolidWorks</w:t>
       </w:r>
     </w:p>
     <w:p>

</xml_diff>